<commit_message>
Updated supplement document for troubleshooting after fixing the licensing issue after Windows update
</commit_message>
<xml_diff>
--- a/Supplements/QUARC_Setup_English.docx
+++ b/Supplements/QUARC_Setup_English.docx
@@ -99,23 +99,7 @@
         </w:numPr>
       </w:pPr>
       <w:r>
-        <w:t xml:space="preserve">Install </w:t>
-      </w:r>
-      <w:proofErr w:type="spellStart"/>
-      <w:r>
-        <w:t>Matlab</w:t>
-      </w:r>
-      <w:proofErr w:type="spellEnd"/>
-      <w:r>
-        <w:t xml:space="preserve"> with Simulink. Matlab must be version 2022b at most. For newer versions, a newer Quarc license is required. Simply install all components. License code is in the file FIK.txt and the network license file is </w:t>
-      </w:r>
-      <w:proofErr w:type="spellStart"/>
-      <w:r>
-        <w:t>network.lic</w:t>
-      </w:r>
-      <w:proofErr w:type="spellEnd"/>
-      <w:r>
-        <w:t>.</w:t>
+        <w:t>Install Matlab with Simulink. Matlab must be version 2022b at most. For newer versions, a newer Quarc license is required. Simply install all components. License code is in the file FIK.txt and the network license file is network.lic.</w:t>
       </w:r>
     </w:p>
     <w:p>
@@ -174,15 +158,7 @@
     </w:p>
     <w:p>
       <w:r>
-        <w:t xml:space="preserve">3. Run the command 'mex –setup' in the command line for </w:t>
-      </w:r>
-      <w:proofErr w:type="spellStart"/>
-      <w:r>
-        <w:t>Matlab</w:t>
-      </w:r>
-      <w:proofErr w:type="spellEnd"/>
-      <w:r>
-        <w:t xml:space="preserve"> integration.</w:t>
+        <w:t>3. Run the command 'mex –setup' in the command line for Matlab integration.</w:t>
       </w:r>
     </w:p>
     <w:p>
@@ -501,15 +477,7 @@
         <w:pStyle w:val="Heading3"/>
       </w:pPr>
       <w:r>
-        <w:t>'</w:t>
-      </w:r>
-      <w:proofErr w:type="spellStart"/>
-      <w:r>
-        <w:t>Quarc_library</w:t>
-      </w:r>
-      <w:proofErr w:type="spellEnd"/>
-      <w:r>
-        <w:t>' not found</w:t>
+        <w:t>'Quarc_library' not found</w:t>
       </w:r>
     </w:p>
     <w:p>
@@ -579,6 +547,148 @@
         <w:t>This function adds the QUARC Targets library to the MATLAB path and updates the MATLAB documentation. It also performs other setup tasks to make QUARC fully functional in MATLAB and Simulink.</w:t>
       </w:r>
     </w:p>
+    <w:p>
+      <w:r>
+        <w:br w:type="page"/>
+      </w:r>
+    </w:p>
+    <w:p>
+      <w:pPr>
+        <w:pStyle w:val="Heading1"/>
+      </w:pPr>
+      <w:r>
+        <w:lastRenderedPageBreak/>
+        <w:t>Notes by Thomas Lønne Stiansen</w:t>
+      </w:r>
+    </w:p>
+    <w:p>
+      <w:pPr>
+        <w:pStyle w:val="Heading2"/>
+      </w:pPr>
+      <w:r>
+        <w:t>Toolchain not recognized / Installation Repair / License</w:t>
+      </w:r>
+    </w:p>
+    <w:p>
+      <w:pPr>
+        <w:rPr>
+          <w:b/>
+          <w:bCs/>
+        </w:rPr>
+      </w:pPr>
+      <w:r>
+        <w:t xml:space="preserve">Upon major updates of Windows, the Quanser programs may run into trouble. </w:t>
+      </w:r>
+      <w:r>
+        <w:t xml:space="preserve">This makes it unable to recognize the toolchain selected in Simulink, which is solved by running the repair installation: </w:t>
+      </w:r>
+      <w:r>
+        <w:tab/>
+      </w:r>
+      <w:r>
+        <w:rPr>
+          <w:b/>
+          <w:bCs/>
+        </w:rPr>
+        <w:t>C:\</w:t>
+      </w:r>
+      <w:r>
+        <w:rPr>
+          <w:b/>
+          <w:bCs/>
+        </w:rPr>
+        <w:t>Global\Software\quarc2022sp1\quarc</w:t>
+      </w:r>
+      <w:r>
+        <w:rPr>
+          <w:b/>
+          <w:bCs/>
+        </w:rPr>
+        <w:t>\install_quarc.exe</w:t>
+      </w:r>
+    </w:p>
+    <w:p>
+      <w:pPr>
+        <w:rPr>
+          <w:b/>
+          <w:bCs/>
+        </w:rPr>
+      </w:pPr>
+      <w:r>
+        <w:t>This repair has to be r</w:t>
+      </w:r>
+      <w:r>
+        <w:t>u</w:t>
+      </w:r>
+      <w:r>
+        <w:t xml:space="preserve">n as </w:t>
+      </w:r>
+      <w:r>
+        <w:t>a</w:t>
+      </w:r>
+      <w:r>
+        <w:t>dmin</w:t>
+      </w:r>
+      <w:r>
+        <w:t>istrator</w:t>
+      </w:r>
+      <w:r>
+        <w:t>, but</w:t>
+      </w:r>
+      <w:r>
+        <w:t xml:space="preserve"> may yet fail as the license path has to be updated. This is done by </w:t>
+      </w:r>
+      <w:r>
+        <w:t>selecting the “change” option instead of “repair” after running the executable file (install_quarc.exe)</w:t>
+      </w:r>
+      <w:r>
+        <w:t xml:space="preserve">, then pasting the updated license path. As of writing this, the location is: </w:t>
+      </w:r>
+      <w:r>
+        <w:rPr>
+          <w:b/>
+          <w:bCs/>
+        </w:rPr>
+        <w:t>C:\Global\Software</w:t>
+      </w:r>
+      <w:r>
+        <w:rPr>
+          <w:b/>
+          <w:bCs/>
+        </w:rPr>
+        <w:t>\</w:t>
+      </w:r>
+      <w:r>
+        <w:rPr>
+          <w:b/>
+          <w:bCs/>
+        </w:rPr>
+        <w:t>11920 QUARC Essentials Fh Vorarlberg.qlic</w:t>
+      </w:r>
+    </w:p>
+    <w:p>
+      <w:pPr>
+        <w:pStyle w:val="Heading2"/>
+      </w:pPr>
+      <w:r>
+        <w:t>Permission Denied</w:t>
+      </w:r>
+    </w:p>
+    <w:p>
+      <w:r>
+        <w:t xml:space="preserve">May occur if running the Simulink in a folder without sufficient permissions. Simply change current working directory to </w:t>
+      </w:r>
+      <w:r>
+        <w:t xml:space="preserve">one you have permissions for </w:t>
+      </w:r>
+      <w:r>
+        <w:rPr>
+          <w:rFonts w:ascii="Segoe UI Emoji" w:eastAsia="Segoe UI Emoji" w:hAnsi="Segoe UI Emoji" w:cs="Segoe UI Emoji"/>
+        </w:rPr>
+        <w:t>:)</w:t>
+      </w:r>
+    </w:p>
+    <w:p/>
     <w:sectPr>
       <w:headerReference w:type="default" r:id="rId16"/>
       <w:pgSz w:w="12240" w:h="15840"/>

</xml_diff>